<commit_message>
Fix apostrophe/en-dash/superscript/author formatting in docx
</commit_message>
<xml_diff>
--- a/reports/manuscript_draft_v1.docx
+++ b/reports/manuscript_draft_v1.docx
@@ -45,13 +45,17 @@
         </w:rPr>
         <w:t>ZJY</w:t>
       </w:r>
+    </w:p>
+    <w:p>
+      <w:pPr>
+        <w:jc w:val="center"/>
+      </w:pPr>
       <w:r>
         <w:rPr>
           <w:i/>
           <w:sz w:val="20"/>
         </w:rPr>
-        <w:br/>
-        <w:t>China</w:t>
+        <w:t>Affiliation: China</w:t>
       </w:r>
     </w:p>
     <w:p>
@@ -220,7 +224,24 @@
           <w:i w:val="0"/>
           <w:sz w:val="20"/>
         </w:rPr>
-        <w:t xml:space="preserve"> = 1.9 × 10-5, Cliff's δ = -1.0) and </w:t>
+        <w:t xml:space="preserve"> = 1.9 × 10</w:t>
+      </w:r>
+      <w:r>
+        <w:rPr>
+          <w:b w:val="0"/>
+          <w:i w:val="0"/>
+          <w:sz w:val="16"/>
+          <w:vertAlign w:val="superscript"/>
+        </w:rPr>
+        <w:t>⁻⁵</w:t>
+      </w:r>
+      <w:r>
+        <w:rPr>
+          <w:b w:val="0"/>
+          <w:i w:val="0"/>
+          <w:sz w:val="20"/>
+        </w:rPr>
+        <w:t xml:space="preserve">, Cliff's δ = -1.0) and </w:t>
       </w:r>
       <w:r>
         <w:rPr>
@@ -252,7 +273,24 @@
           <w:i w:val="0"/>
           <w:sz w:val="20"/>
         </w:rPr>
-        <w:t xml:space="preserve"> = 5.7 × 10-5, δ = -1.0), with both effects surviving Benjamini–Hochberg correction. Within </w:t>
+        <w:t xml:space="preserve"> = 5.7 × 10</w:t>
+      </w:r>
+      <w:r>
+        <w:rPr>
+          <w:b w:val="0"/>
+          <w:i w:val="0"/>
+          <w:sz w:val="16"/>
+          <w:vertAlign w:val="superscript"/>
+        </w:rPr>
+        <w:t>⁻⁵</w:t>
+      </w:r>
+      <w:r>
+        <w:rPr>
+          <w:b w:val="0"/>
+          <w:i w:val="0"/>
+          <w:sz w:val="20"/>
+        </w:rPr>
+        <w:t xml:space="preserve">, δ = -1.0), with both effects surviving Benjamini–Hochberg correction. Within </w:t>
       </w:r>
       <w:r>
         <w:rPr>
@@ -305,7 +343,41 @@
           <w:i w:val="0"/>
           <w:sz w:val="22"/>
         </w:rPr>
-        <w:t>The International Space Station (ISS) presents a biologically distinctive habitat: a permanently inhabited, physically sealed environment characterised by microgravity, elevated galactic cosmic radiation, recirculated atmosphere, and a founding microbial community that has evolved in near-isolation from environmental reservoirs for decades1-2. Longitudinal surface and air sampling programmes have documented a taxonomically restricted ISS microbiome dominated by human-associated Firmicutes and Actinobacteria, with marked reductions in environmental bacterial diversity relative to ground analogues2-3. However, the genomic functional consequences of sustained ISS residence—whether specific defence, mobility, or adaptation gene classes undergo directional change—remain poorly characterised.</w:t>
+        <w:t>The International Space Station (ISS) presents a biologically distinctive habitat: a permanently inhabited, physically sealed environment characterised by microgravity, elevated galactic cosmic radiation, recirculated atmosphere, and a founding microbial community that has evolved in near-isolation from environmental reservoirs for decades</w:t>
+      </w:r>
+      <w:r>
+        <w:rPr>
+          <w:b w:val="0"/>
+          <w:i w:val="0"/>
+          <w:sz w:val="18"/>
+          <w:vertAlign w:val="superscript"/>
+        </w:rPr>
+        <w:t>¹⁻²</w:t>
+      </w:r>
+      <w:r>
+        <w:rPr>
+          <w:b w:val="0"/>
+          <w:i w:val="0"/>
+          <w:sz w:val="22"/>
+        </w:rPr>
+        <w:t>. Longitudinal surface and air sampling programmes have documented a taxonomically restricted ISS microbiome dominated by human-associated Firmicutes and Actinobacteria, with marked reductions in environmental bacterial diversity relative to ground analogues</w:t>
+      </w:r>
+      <w:r>
+        <w:rPr>
+          <w:b w:val="0"/>
+          <w:i w:val="0"/>
+          <w:sz w:val="18"/>
+          <w:vertAlign w:val="superscript"/>
+        </w:rPr>
+        <w:t>²⁻³</w:t>
+      </w:r>
+      <w:r>
+        <w:rPr>
+          <w:b w:val="0"/>
+          <w:i w:val="0"/>
+          <w:sz w:val="22"/>
+        </w:rPr>
+        <w:t>. However, the genomic functional consequences of sustained ISS residence—whether specific defence, mobility, or adaptation gene classes undergo directional change—remain poorly characterised.</w:t>
       </w:r>
     </w:p>
     <w:p>
@@ -318,7 +390,41 @@
           <w:i w:val="0"/>
           <w:sz w:val="22"/>
         </w:rPr>
-        <w:t>CRISPR-Cas systems function as adaptive prokaryotic immune systems targeting invading mobile genetic elements (MGEs), including bacteriophages and plasmids4. Their maintenance is metabolically costly; in environments with reduced phage diversity or limited horizontal gene transfer, CRISPR-Cas arrays are expected to decay under purifying selection5-6. The ISS, with its physically sealed airlock and infrequent introduction of novel microbial genotypes, may provide precisely such conditions: a low-phage-pressure environment in which CRISPR-Cas investment offers diminishing adaptive returns.</w:t>
+        <w:t>CRISPR-Cas systems function as adaptive prokaryotic immune systems targeting invading mobile genetic elements (MGEs), including bacteriophages and plasmids</w:t>
+      </w:r>
+      <w:r>
+        <w:rPr>
+          <w:b w:val="0"/>
+          <w:i w:val="0"/>
+          <w:sz w:val="18"/>
+          <w:vertAlign w:val="superscript"/>
+        </w:rPr>
+        <w:t>4</w:t>
+      </w:r>
+      <w:r>
+        <w:rPr>
+          <w:b w:val="0"/>
+          <w:i w:val="0"/>
+          <w:sz w:val="22"/>
+        </w:rPr>
+        <w:t>. Their maintenance is metabolically costly; in environments with reduced phage diversity or limited horizontal gene transfer, CRISPR-Cas arrays are expected to decay under purifying selection</w:t>
+      </w:r>
+      <w:r>
+        <w:rPr>
+          <w:b w:val="0"/>
+          <w:i w:val="0"/>
+          <w:sz w:val="18"/>
+          <w:vertAlign w:val="superscript"/>
+        </w:rPr>
+        <w:t>⁵⁻⁶</w:t>
+      </w:r>
+      <w:r>
+        <w:rPr>
+          <w:b w:val="0"/>
+          <w:i w:val="0"/>
+          <w:sz w:val="22"/>
+        </w:rPr>
+        <w:t>. The ISS, with its physically sealed airlock and infrequent introduction of novel microbial genotypes, may provide precisely such conditions: a low-phage-pressure environment in which CRISPR-Cas investment offers diminishing adaptive returns.</w:t>
       </w:r>
     </w:p>
     <w:p>
@@ -331,7 +437,41 @@
           <w:i w:val="0"/>
           <w:sz w:val="22"/>
         </w:rPr>
-        <w:t>Insertion sequences (IS elements)—the simplest autonomous transposable elements in prokaryotes—represent the dominant class of MGEs in bacterial genomes. IS elements facilitate genomic rearrangements, horizontal gene transfer, and adaptive evolution, but also impose fitness costs through insertional mutagenesis7. Crucially, CRISPR-Cas systems restrict IS element proliferation, and prior modelling predicts that CRISPR loss may be accompanied by IS element accumulation through relaxed transposon immunity8. Contrary to this expectation, and consistent with a generalised defence investment reduction rather than simple CRISPR replacement, we hypothesised that ISS isolates may show co-reduction of both CRISPR and IS element load.</w:t>
+        <w:t>Insertion sequences (IS elements)—the simplest autonomous transposable elements in prokaryotes—represent the dominant class of MGEs in bacterial genomes. IS elements facilitate genomic rearrangements, horizontal gene transfer, and adaptive evolution, but also impose fitness costs through insertional mutagenesis</w:t>
+      </w:r>
+      <w:r>
+        <w:rPr>
+          <w:b w:val="0"/>
+          <w:i w:val="0"/>
+          <w:sz w:val="18"/>
+          <w:vertAlign w:val="superscript"/>
+        </w:rPr>
+        <w:t>7</w:t>
+      </w:r>
+      <w:r>
+        <w:rPr>
+          <w:b w:val="0"/>
+          <w:i w:val="0"/>
+          <w:sz w:val="22"/>
+        </w:rPr>
+        <w:t>. Crucially, CRISPR-Cas systems restrict IS element proliferation, and prior modelling predicts that CRISPR loss may be accompanied by IS element accumulation through relaxed transposon immunity</w:t>
+      </w:r>
+      <w:r>
+        <w:rPr>
+          <w:b w:val="0"/>
+          <w:i w:val="0"/>
+          <w:sz w:val="18"/>
+          <w:vertAlign w:val="superscript"/>
+        </w:rPr>
+        <w:t>8</w:t>
+      </w:r>
+      <w:r>
+        <w:rPr>
+          <w:b w:val="0"/>
+          <w:i w:val="0"/>
+          <w:sz w:val="22"/>
+        </w:rPr>
+        <w:t>. Contrary to this expectation, and consistent with a generalised defence investment reduction rather than simple CRISPR replacement, we hypothesised that ISS isolates may show co-reduction of both CRISPR and IS element load.</w:t>
       </w:r>
     </w:p>
     <w:p>
@@ -344,7 +484,24 @@
           <w:i w:val="0"/>
           <w:sz w:val="22"/>
         </w:rPr>
-        <w:t>Reductive genome evolution under stable, isolated conditions is well-documented in obligate intracellular bacteria and host-restricted pathogens9. Analogously, we propose that the ISS—as a closed, resource-defined microenvironment—may drive a form of genomic streamlining in its resident Bacillales community, reducing the metabolic burden of maintaining defence and mobile element repertoires that provide limited benefit in a phage-poor, transfer-limited habitat.</w:t>
+        <w:t>Reductive genome evolution under stable, isolated conditions is well-documented in obligate intracellular bacteria and host-restricted pathogens</w:t>
+      </w:r>
+      <w:r>
+        <w:rPr>
+          <w:b w:val="0"/>
+          <w:i w:val="0"/>
+          <w:sz w:val="18"/>
+          <w:vertAlign w:val="superscript"/>
+        </w:rPr>
+        <w:t>9</w:t>
+      </w:r>
+      <w:r>
+        <w:rPr>
+          <w:b w:val="0"/>
+          <w:i w:val="0"/>
+          <w:sz w:val="22"/>
+        </w:rPr>
+        <w:t>. Analogously, we propose that the ISS—as a closed, resource-defined microenvironment—may drive a form of genomic streamlining in its resident Bacillales community, reducing the metabolic burden of maintaining defence and mobile element repertoires that provide limited benefit in a phage-poor, transfer-limited habitat.</w:t>
       </w:r>
     </w:p>
     <w:p>
@@ -1511,7 +1668,24 @@
           <w:i w:val="0"/>
           <w:sz w:val="22"/>
         </w:rPr>
-        <w:t xml:space="preserve"> = 1.9 × 10-5, Cliff's δ = -1.0 [95% bootstrap CI -1.0, -1.0]; BH </w:t>
+        <w:t xml:space="preserve"> = 1.9 × 10</w:t>
+      </w:r>
+      <w:r>
+        <w:rPr>
+          <w:b w:val="0"/>
+          <w:i w:val="0"/>
+          <w:sz w:val="18"/>
+          <w:vertAlign w:val="superscript"/>
+        </w:rPr>
+        <w:t>⁻⁵</w:t>
+      </w:r>
+      <w:r>
+        <w:rPr>
+          <w:b w:val="0"/>
+          <w:i w:val="0"/>
+          <w:sz w:val="22"/>
+        </w:rPr>
+        <w:t xml:space="preserve">, Cliff's δ = -1.0 [95% bootstrap CI -1.0, -1.0]; BH </w:t>
       </w:r>
       <w:r>
         <w:rPr>
@@ -1580,7 +1754,24 @@
           <w:i w:val="0"/>
           <w:sz w:val="22"/>
         </w:rPr>
-        <w:t xml:space="preserve"> = 5.7 × 10-5, δ = -1.0 [95% CI -1.0, -1.0]; BH </w:t>
+        <w:t xml:space="preserve"> = 5.7 × 10</w:t>
+      </w:r>
+      <w:r>
+        <w:rPr>
+          <w:b w:val="0"/>
+          <w:i w:val="0"/>
+          <w:sz w:val="18"/>
+          <w:vertAlign w:val="superscript"/>
+        </w:rPr>
+        <w:t>⁻⁵</w:t>
+      </w:r>
+      <w:r>
+        <w:rPr>
+          <w:b w:val="0"/>
+          <w:i w:val="0"/>
+          <w:sz w:val="22"/>
+        </w:rPr>
+        <w:t xml:space="preserve">, δ = -1.0 [95% CI -1.0, -1.0]; BH </w:t>
       </w:r>
       <w:r>
         <w:rPr>
@@ -2028,7 +2219,16 @@
                 <w:i w:val="0"/>
                 <w:sz w:val="18"/>
               </w:rPr>
-              <w:t>1.9 × 10-5</w:t>
+              <w:t>1.9 × 10</w:t>
+            </w:r>
+            <w:r>
+              <w:rPr>
+                <w:b w:val="0"/>
+                <w:i w:val="0"/>
+                <w:sz w:val="14"/>
+                <w:vertAlign w:val="superscript"/>
+              </w:rPr>
+              <w:t>⁻⁵</w:t>
             </w:r>
           </w:p>
         </w:tc>
@@ -2356,7 +2556,16 @@
                 <w:i w:val="0"/>
                 <w:sz w:val="18"/>
               </w:rPr>
-              <w:t>5.7 × 10-5</w:t>
+              <w:t>5.7 × 10</w:t>
+            </w:r>
+            <w:r>
+              <w:rPr>
+                <w:b w:val="0"/>
+                <w:i w:val="0"/>
+                <w:sz w:val="14"/>
+                <w:vertAlign w:val="superscript"/>
+              </w:rPr>
+              <w:t>⁻⁵</w:t>
             </w:r>
           </w:p>
         </w:tc>
@@ -2846,7 +3055,24 @@
           <w:i w:val="0"/>
           <w:sz w:val="22"/>
         </w:rPr>
-        <w:t>We interpret these findings as consistent with a model of defence system streamlining under closed-environment selection. The ISS is characterised by: (i) near-absence of novel environmental phage sources, reducing the adaptive value of CRISPR-Cas memory acquisition; (ii) physical isolation from horizontal gene transfer reservoirs, diminishing the selective benefit of IS-mediated genomic flexibility; and (iii) small effective population size, potentially amplifying genetic drift and reducing the efficacy of purifying selection against costly defence elements. Together, these conditions mirror those associated with reductive genome evolution in obligate intracellular bacteria and host-restricted pathogens—well-documented cases in which genes dispensable in stable, isolated environments are progressively lost9-10.</w:t>
+        <w:t>We interpret these findings as consistent with a model of defence system streamlining under closed-environment selection. The ISS is characterised by: (i) near-absence of novel environmental phage sources, reducing the adaptive value of CRISPR-Cas memory acquisition; (ii) physical isolation from horizontal gene transfer reservoirs, diminishing the selective benefit of IS-mediated genomic flexibility; and (iii) small effective population size, potentially amplifying genetic drift and reducing the efficacy of purifying selection against costly defence elements. Together, these conditions mirror those associated with reductive genome evolution in obligate intracellular bacteria and host-restricted pathogens—well-documented cases in which genes dispensable in stable, isolated environments are progressively lost</w:t>
+      </w:r>
+      <w:r>
+        <w:rPr>
+          <w:b w:val="0"/>
+          <w:i w:val="0"/>
+          <w:sz w:val="18"/>
+          <w:vertAlign w:val="superscript"/>
+        </w:rPr>
+        <w:t>⁹⁻¹⁰</w:t>
+      </w:r>
+      <w:r>
+        <w:rPr>
+          <w:b w:val="0"/>
+          <w:i w:val="0"/>
+          <w:sz w:val="22"/>
+        </w:rPr>
+        <w:t>.</w:t>
       </w:r>
     </w:p>
     <w:p>
@@ -2859,7 +3085,41 @@
           <w:i w:val="0"/>
           <w:sz w:val="22"/>
         </w:rPr>
-        <w:t>Analogously, CRISPR-Cas systems impose measurable fitness costs: maintenance of spacer acquisition machinery, Cas protein expression, and interference activity are metabolically costly even in the absence of active infection11. In an environment with low phage diversity and limited novel element introduction, this cost exceeds the benefit, creating a selection pressure for CRISPR decay. IS element proliferation, normally restrained partly by CRISPR-mediated targeting of transposon-derived sequences, would be expected to increase following CRISPR loss under the canonical model8; instead, we observe co-reduction. We propose that IS element loss in the ISS environment reflects the convergent logic of mobile element containment in a closed habitat: elements that facilitate genetic exchange are selectively neutral or costly when inter-strain transfer opportunities are limited.</w:t>
+        <w:t>Analogously, CRISPR-Cas systems impose measurable fitness costs: maintenance of spacer acquisition machinery, Cas protein expression, and interference activity are metabolically costly even in the absence of active infection</w:t>
+      </w:r>
+      <w:r>
+        <w:rPr>
+          <w:b w:val="0"/>
+          <w:i w:val="0"/>
+          <w:sz w:val="18"/>
+          <w:vertAlign w:val="superscript"/>
+        </w:rPr>
+        <w:t>¹¹</w:t>
+      </w:r>
+      <w:r>
+        <w:rPr>
+          <w:b w:val="0"/>
+          <w:i w:val="0"/>
+          <w:sz w:val="22"/>
+        </w:rPr>
+        <w:t>. In an environment with low phage diversity and limited novel element introduction, this cost exceeds the benefit, creating a selection pressure for CRISPR decay. IS element proliferation, normally restrained partly by CRISPR-mediated targeting of transposon-derived sequences, would be expected to increase following CRISPR loss under the canonical model</w:t>
+      </w:r>
+      <w:r>
+        <w:rPr>
+          <w:b w:val="0"/>
+          <w:i w:val="0"/>
+          <w:sz w:val="18"/>
+          <w:vertAlign w:val="superscript"/>
+        </w:rPr>
+        <w:t>8</w:t>
+      </w:r>
+      <w:r>
+        <w:rPr>
+          <w:b w:val="0"/>
+          <w:i w:val="0"/>
+          <w:sz w:val="22"/>
+        </w:rPr>
+        <w:t>; instead, we observe co-reduction. We propose that IS element loss in the ISS environment reflects the convergent logic of mobile element containment in a closed habitat: elements that facilitate genetic exchange are selectively neutral or costly when inter-strain transfer opportunities are limited.</w:t>
       </w:r>
     </w:p>
     <w:p>
@@ -2944,7 +3204,24 @@
           <w:i w:val="0"/>
           <w:sz w:val="22"/>
         </w:rPr>
-        <w:t xml:space="preserve"> is a phylogenetically distinct lineage with a large accessory genome and a history of extensive IS-mediated rearrangements in industrial and plant-associated strains12. One interpretation is that ISS </w:t>
+        <w:t xml:space="preserve"> is a phylogenetically distinct lineage with a large accessory genome and a history of extensive IS-mediated rearrangements in industrial and plant-associated strains</w:t>
+      </w:r>
+      <w:r>
+        <w:rPr>
+          <w:b w:val="0"/>
+          <w:i w:val="0"/>
+          <w:sz w:val="18"/>
+          <w:vertAlign w:val="superscript"/>
+        </w:rPr>
+        <w:t>¹²</w:t>
+      </w:r>
+      <w:r>
+        <w:rPr>
+          <w:b w:val="0"/>
+          <w:i w:val="0"/>
+          <w:sz w:val="22"/>
+        </w:rPr>
+        <w:t xml:space="preserve">. One interpretation is that ISS </w:t>
       </w:r>
       <w:r>
         <w:rPr>
@@ -3050,7 +3327,24 @@
           <w:i w:val="0"/>
           <w:sz w:val="22"/>
         </w:rPr>
-        <w:t xml:space="preserve">Our CRISPR-Cas detection relies on GFF CDS annotation matching to cas gene product names (Cas1, Cas2, Cas3, Cas9, CRISPR-associated). This approach detects the presence of cas protein-coding genes but does not directly query CRISPR repeat arrays; incomplete annotations may miss partial cas operons or highly diverged Cas proteins. Validation using CRISPRCasFinder13 on complete genome sequences would provide higher confidence. However, V-007 of our validation pipeline confirmed that GFF-based Cas detection is fully concordant with the feature matrix counts in the ground </w:t>
+        <w:t>Our CRISPR-Cas detection relies on GFF CDS annotation matching to cas gene product names (Cas1, Cas2, Cas3, Cas9, CRISPR-associated). This approach detects the presence of cas protein-coding genes but does not directly query CRISPR repeat arrays; incomplete annotations may miss partial cas operons or highly diverged Cas proteins. Validation using CRISPRCasFinder</w:t>
+      </w:r>
+      <w:r>
+        <w:rPr>
+          <w:b w:val="0"/>
+          <w:i w:val="0"/>
+          <w:sz w:val="18"/>
+          <w:vertAlign w:val="superscript"/>
+        </w:rPr>
+        <w:t>¹³</w:t>
+      </w:r>
+      <w:r>
+        <w:rPr>
+          <w:b w:val="0"/>
+          <w:i w:val="0"/>
+          <w:sz w:val="22"/>
+        </w:rPr>
+        <w:t xml:space="preserve"> on complete genome sequences would provide higher confidence. However, V-007 of our validation pipeline confirmed that GFF-based Cas detection is fully concordant with the feature matrix counts in the ground </w:t>
       </w:r>
       <w:r>
         <w:rPr>
@@ -3463,7 +3757,24 @@
           <w:i w:val="0"/>
           <w:sz w:val="22"/>
         </w:rPr>
-        <w:t xml:space="preserve"> Two-sided Fisher's exact tests for CRISPR-Cas prevalence differences were implemented in pure Python using log-gamma exact probability calculation14. Contingency table entries were ISS CRISPR+ / ISS CRISPR- / Ground CRISPR+ / Ground CRISPR-.</w:t>
+        <w:t xml:space="preserve"> Two-sided Fisher's exact tests for CRISPR-Cas prevalence differences were implemented in pure Python using log-gamma exact probability calculation</w:t>
+      </w:r>
+      <w:r>
+        <w:rPr>
+          <w:b w:val="0"/>
+          <w:i w:val="0"/>
+          <w:sz w:val="18"/>
+          <w:vertAlign w:val="superscript"/>
+        </w:rPr>
+        <w:t>¹⁴</w:t>
+      </w:r>
+      <w:r>
+        <w:rPr>
+          <w:b w:val="0"/>
+          <w:i w:val="0"/>
+          <w:sz w:val="22"/>
+        </w:rPr>
+        <w:t>. Contingency table entries were ISS CRISPR+ / ISS CRISPR- / Ground CRISPR+ / Ground CRISPR-.</w:t>
       </w:r>
     </w:p>
     <w:p>
@@ -3542,7 +3853,24 @@
           <w:i w:val="0"/>
           <w:sz w:val="22"/>
         </w:rPr>
-        <w:t xml:space="preserve"> Benjamini–Hochberg false discovery rate (FDR) correction was applied simultaneously to all eight species × phenotype comparisons (four species × CRISPR + four species × IS element), controlling the expected FDR at 5%15.</w:t>
+        <w:t xml:space="preserve"> Benjamini–Hochberg false discovery rate (FDR) correction was applied simultaneously to all eight species × phenotype comparisons (four species × CRISPR + four species × IS element), controlling the expected FDR at 5%</w:t>
+      </w:r>
+      <w:r>
+        <w:rPr>
+          <w:b w:val="0"/>
+          <w:i w:val="0"/>
+          <w:sz w:val="18"/>
+          <w:vertAlign w:val="superscript"/>
+        </w:rPr>
+        <w:t>¹⁵</w:t>
+      </w:r>
+      <w:r>
+        <w:rPr>
+          <w:b w:val="0"/>
+          <w:i w:val="0"/>
+          <w:sz w:val="22"/>
+        </w:rPr>
+        <w:t>.</w:t>
       </w:r>
     </w:p>
     <w:p>

</xml_diff>

<commit_message>
Replace em-dash/multiplication/Greek chars for bioRxiv ASCII compatibility
</commit_message>
<xml_diff>
--- a/reports/manuscript_draft_v1.docx
+++ b/reports/manuscript_draft_v1.docx
@@ -144,7 +144,7 @@
           <w:i w:val="0"/>
           <w:sz w:val="20"/>
         </w:rPr>
-        <w:t xml:space="preserve">The International Space Station (ISS) represents an extreme, physically isolated environment subject to sustained selection pressures including microgravity and a near-complete absence of environmental reservoirs for horizontal gene transfer. Whether ISS Bacillales show systematic reduction of defence-associated genomic elements under these conditions is unknown. Here, we performed species-stratified comparative genomics of 30 ISS isolates (NCBI BioProject PRJNA637984) and 55 matched ground-isolated genomes across four Bacillales species. Controlling for species composition—a critical methodological requirement, since three of four species naturally lack CRISPR-Cas in both ISS and ground environments—we demonstrate that </w:t>
+        <w:t xml:space="preserve">The International Space Station (ISS) represents an extreme, physically isolated environment subject to sustained selection pressures including microgravity and a near-complete absence of environmental reservoirs for horizontal gene transfer. Whether ISS Bacillales show systematic reduction of defence-associated genomic elements under these conditions is unknown. Here, we performed species-stratified comparative genomics of 30 ISS isolates (NCBI BioProject PRJNA637984) and 55 matched ground-isolated genomes across four Bacillales species. Controlling for species composition--a critical methodological requirement, since three of four species naturally lack CRISPR-Cas in both ISS and ground environments--we demonstrate that </w:t>
       </w:r>
       <w:r>
         <w:rPr>
@@ -176,7 +176,7 @@
           <w:i w:val="0"/>
           <w:sz w:val="20"/>
         </w:rPr>
-        <w:t xml:space="preserve"> = 0.0095, Benjamini–Hochberg FDR </w:t>
+        <w:t xml:space="preserve"> = 0.0095, Benjamini-Hochberg FDR </w:t>
       </w:r>
       <w:r>
         <w:rPr>
@@ -208,7 +208,7 @@
           <w:i w:val="0"/>
           <w:sz w:val="20"/>
         </w:rPr>
-        <w:t xml:space="preserve"> (0.115-fold; Mann–Whitney U = 0, </w:t>
+        <w:t xml:space="preserve"> (0.115-fold; Mann-Whitney U = 0, </w:t>
       </w:r>
       <w:r>
         <w:rPr>
@@ -224,7 +224,7 @@
           <w:i w:val="0"/>
           <w:sz w:val="20"/>
         </w:rPr>
-        <w:t xml:space="preserve"> = 1.9 × 10</w:t>
+        <w:t xml:space="preserve"> = 1.9 x 10</w:t>
       </w:r>
       <w:r>
         <w:rPr>
@@ -241,7 +241,7 @@
           <w:i w:val="0"/>
           <w:sz w:val="20"/>
         </w:rPr>
-        <w:t xml:space="preserve">, Cliff's δ = -1.0) and </w:t>
+        <w:t xml:space="preserve">, Cliff's delta = -1.0) and </w:t>
       </w:r>
       <w:r>
         <w:rPr>
@@ -273,7 +273,7 @@
           <w:i w:val="0"/>
           <w:sz w:val="20"/>
         </w:rPr>
-        <w:t xml:space="preserve"> = 5.7 × 10</w:t>
+        <w:t xml:space="preserve"> = 5.7 x 10</w:t>
       </w:r>
       <w:r>
         <w:rPr>
@@ -290,7 +290,7 @@
           <w:i w:val="0"/>
           <w:sz w:val="20"/>
         </w:rPr>
-        <w:t xml:space="preserve">, δ = -1.0), with both effects surviving Benjamini–Hochberg correction. Within </w:t>
+        <w:t xml:space="preserve">, delta = -1.0), with both effects surviving Benjamini-Hochberg correction. Within </w:t>
       </w:r>
       <w:r>
         <w:rPr>
@@ -322,7 +322,7 @@
           <w:i w:val="0"/>
           <w:sz w:val="20"/>
         </w:rPr>
-        <w:t xml:space="preserve"> = 0.003, δ = -0.75), indicating co-loss of the two defence compartments. These findings are independently corroborated by metagenomics (GLDS-224): ISS debris samples showed 50.3% lower CRISPR-associated KO density than ground controls. Collectively, our data are consistent with a model of coordinated defence system streamlining under closed-environment selection, analogous to reductive genome evolution in host-restricted microorganisms.</w:t>
+        <w:t xml:space="preserve"> = 0.003, delta = -0.75), indicating co-loss of the two defence compartments. These findings are independently corroborated by metagenomics (GLDS-224): ISS debris samples showed 50.3% lower CRISPR-associated KO density than ground controls. Collectively, our data are consistent with a model of coordinated defence system streamlining under closed-environment selection, analogous to reductive genome evolution in host-restricted microorganisms.</w:t>
       </w:r>
     </w:p>
     <w:p>
@@ -377,7 +377,7 @@
           <w:i w:val="0"/>
           <w:sz w:val="22"/>
         </w:rPr>
-        <w:t>. However, the genomic functional consequences of sustained ISS residence—whether specific defence, mobility, or adaptation gene classes undergo directional change—remain poorly characterised.</w:t>
+        <w:t>. However, the genomic functional consequences of sustained ISS residence--whether specific defence, mobility, or adaptation gene classes undergo directional change--remain poorly characterised.</w:t>
       </w:r>
     </w:p>
     <w:p>
@@ -437,7 +437,7 @@
           <w:i w:val="0"/>
           <w:sz w:val="22"/>
         </w:rPr>
-        <w:t>Insertion sequences (IS elements)—the simplest autonomous transposable elements in prokaryotes—represent the dominant class of MGEs in bacterial genomes. IS elements facilitate genomic rearrangements, horizontal gene transfer, and adaptive evolution, but also impose fitness costs through insertional mutagenesis</w:t>
+        <w:t>Insertion sequences (IS elements)--the simplest autonomous transposable elements in prokaryotes--represent the dominant class of MGEs in bacterial genomes. IS elements facilitate genomic rearrangements, horizontal gene transfer, and adaptive evolution, but also impose fitness costs through insertional mutagenesis</w:t>
       </w:r>
       <w:r>
         <w:rPr>
@@ -501,7 +501,7 @@
           <w:i w:val="0"/>
           <w:sz w:val="22"/>
         </w:rPr>
-        <w:t>. Analogously, we propose that the ISS—as a closed, resource-defined microenvironment—may drive a form of genomic streamlining in its resident Bacillales community, reducing the metabolic burden of maintaining defence and mobile element repertoires that provide limited benefit in a phage-poor, transfer-limited habitat.</w:t>
+        <w:t>. Analogously, we propose that the ISS--as a closed, resource-defined microenvironment--may drive a form of genomic streamlining in its resident Bacillales community, reducing the metabolic burden of maintaining defence and mobile element repertoires that provide limited benefit in a phage-poor, transfer-limited habitat.</w:t>
       </w:r>
     </w:p>
     <w:p>
@@ -790,7 +790,7 @@
           <w:i w:val="0"/>
           <w:sz w:val="22"/>
         </w:rPr>
-        <w:t xml:space="preserve">—the only species with substantial ground CRISPR-Cas prevalence—ISS isolates showed complete CRISPR-Cas absence (0/9, 0%) compared with 53.3% prevalence in ground isolates (8/15; Fisher's exact </w:t>
+        <w:t xml:space="preserve">--the only species with substantial ground CRISPR-Cas prevalence--ISS isolates showed complete CRISPR-Cas absence (0/9, 0%) compared with 53.3% prevalence in ground isolates (8/15; Fisher's exact </w:t>
       </w:r>
       <w:r>
         <w:rPr>
@@ -806,7 +806,7 @@
           <w:i w:val="0"/>
           <w:sz w:val="22"/>
         </w:rPr>
-        <w:t xml:space="preserve"> = 0.0095, two-sided; Benjamini–Hochberg [BH] FDR </w:t>
+        <w:t xml:space="preserve"> = 0.0095, two-sided; Benjamini-Hochberg [BH] FDR </w:t>
       </w:r>
       <w:r>
         <w:rPr>
@@ -902,7 +902,7 @@
           <w:i w:val="0"/>
           <w:sz w:val="22"/>
         </w:rPr>
-        <w:t xml:space="preserve"> Fisher's exact test, estimated by 10,000 bootstrap simulations under the observed prevalence parameters (ISS π1 = 0, Ground π2 = 0.533), was 78.3%, slightly below the conventional 80% threshold; this limitation is attributable to the ISS sample size (n = 9) and is acknowledged accordingly.</w:t>
+        <w:t xml:space="preserve"> Fisher's exact test, estimated by 10,000 bootstrap simulations under the observed prevalence parameters (ISS pi1 = 0, Ground pi2 = 0.533), was 78.3%, slightly below the conventional 80% threshold; this limitation is attributable to the ISS sample size (n = 9) and is acknowledged accordingly.</w:t>
       </w:r>
     </w:p>
     <w:p>
@@ -1610,7 +1610,7 @@
           <w:i w:val="0"/>
           <w:sz w:val="22"/>
         </w:rPr>
-        <w:t>: Benjamini–Hochberg false discovery rate correction applied across all eight species × phenotype comparisons (four species × CRISPR + four species × IS elements).</w:t>
+        <w:t>: Benjamini-Hochberg false discovery rate correction applied across all eight species x phenotype comparisons (four species x CRISPR + four species x IS elements).</w:t>
       </w:r>
     </w:p>
     <w:p>
@@ -1631,7 +1631,7 @@
           <w:i w:val="0"/>
           <w:sz w:val="22"/>
         </w:rPr>
-        <w:t>Across the full panel (all 85 genomes), ISS isolates had lower IS element density than ground isolates (ISS: 2.185 ± 2.374/1,000 CDS; Ground: 5.924 ± 6.172/1,000 CDS; ratio 0.369-fold). To determine whether this difference persisted within individual species, and to exclude the species-composition confound, we performed species-stratified Mann–Whitney U tests with Cliff's delta as the effect size estimator, applying BH FDR correction across all eight comparisons (Table 2; Figure 1b).</w:t>
+        <w:t>Across the full panel (all 85 genomes), ISS isolates had lower IS element density than ground isolates (ISS: 2.185 ± 2.374/1,000 CDS; Ground: 5.924 ± 6.172/1,000 CDS; ratio 0.369-fold). To determine whether this difference persisted within individual species, and to exclude the species-composition confound, we performed species-stratified Mann-Whitney U tests with Cliff's delta as the effect size estimator, applying BH FDR correction across all eight comparisons (Table 2; Figure 1b).</w:t>
       </w:r>
     </w:p>
     <w:p>
@@ -1668,7 +1668,7 @@
           <w:i w:val="0"/>
           <w:sz w:val="22"/>
         </w:rPr>
-        <w:t xml:space="preserve"> = 1.9 × 10</w:t>
+        <w:t xml:space="preserve"> = 1.9 x 10</w:t>
       </w:r>
       <w:r>
         <w:rPr>
@@ -1685,7 +1685,7 @@
           <w:i w:val="0"/>
           <w:sz w:val="22"/>
         </w:rPr>
-        <w:t xml:space="preserve">, Cliff's δ = -1.0 [95% bootstrap CI -1.0, -1.0]; BH </w:t>
+        <w:t xml:space="preserve">, Cliff's delta = -1.0 [95% bootstrap CI -1.0, -1.0]; BH </w:t>
       </w:r>
       <w:r>
         <w:rPr>
@@ -1701,7 +1701,7 @@
           <w:i w:val="0"/>
           <w:sz w:val="22"/>
         </w:rPr>
-        <w:t xml:space="preserve"> = 0.00015). The Cliff's δ = -1.0 indicates complete rank-order separation: every ISS </w:t>
+        <w:t xml:space="preserve"> = 0.00015). The Cliff's delta = -1.0 indicates complete rank-order separation: every ISS </w:t>
       </w:r>
       <w:r>
         <w:rPr>
@@ -1754,7 +1754,7 @@
           <w:i w:val="0"/>
           <w:sz w:val="22"/>
         </w:rPr>
-        <w:t xml:space="preserve"> = 5.7 × 10</w:t>
+        <w:t xml:space="preserve"> = 5.7 x 10</w:t>
       </w:r>
       <w:r>
         <w:rPr>
@@ -1771,7 +1771,7 @@
           <w:i w:val="0"/>
           <w:sz w:val="22"/>
         </w:rPr>
-        <w:t xml:space="preserve">, δ = -1.0 [95% CI -1.0, -1.0]; BH </w:t>
+        <w:t xml:space="preserve">, delta = -1.0 [95% CI -1.0, -1.0]; BH </w:t>
       </w:r>
       <w:r>
         <w:rPr>
@@ -1848,7 +1848,7 @@
           <w:i w:val="0"/>
           <w:sz w:val="22"/>
         </w:rPr>
-        <w:t xml:space="preserve"> = 0.022, δ = +0.57 [95% CI +0.14, +0.94]; BH </w:t>
+        <w:t xml:space="preserve"> = 0.022, delta = +0.57 [95% CI +0.14, +0.94]; BH </w:t>
       </w:r>
       <w:r>
         <w:rPr>
@@ -2037,7 +2037,7 @@
                 <w:b/>
                 <w:sz w:val="18"/>
               </w:rPr>
-              <w:t>Cliff's δ [95% CI]</w:t>
+              <w:t>Cliff's delta [95% CI]</w:t>
             </w:r>
           </w:p>
         </w:tc>
@@ -2183,7 +2183,7 @@
                 <w:i w:val="0"/>
                 <w:sz w:val="18"/>
               </w:rPr>
-              <w:t>0.115×</w:t>
+              <w:t>0.115x</w:t>
             </w:r>
           </w:p>
         </w:tc>
@@ -2219,7 +2219,7 @@
                 <w:i w:val="0"/>
                 <w:sz w:val="18"/>
               </w:rPr>
-              <w:t>1.9 × 10</w:t>
+              <w:t>1.9 x 10</w:t>
             </w:r>
             <w:r>
               <w:rPr>
@@ -2356,7 +2356,7 @@
                 <w:i w:val="0"/>
                 <w:sz w:val="18"/>
               </w:rPr>
-              <w:t>1.445×</w:t>
+              <w:t>1.445x</w:t>
             </w:r>
           </w:p>
         </w:tc>
@@ -2520,7 +2520,7 @@
                 <w:i w:val="0"/>
                 <w:sz w:val="18"/>
               </w:rPr>
-              <w:t>0.312×</w:t>
+              <w:t>0.312x</w:t>
             </w:r>
           </w:p>
         </w:tc>
@@ -2556,7 +2556,7 @@
                 <w:i w:val="0"/>
                 <w:sz w:val="18"/>
               </w:rPr>
-              <w:t>5.7 × 10</w:t>
+              <w:t>5.7 x 10</w:t>
             </w:r>
             <w:r>
               <w:rPr>
@@ -2693,7 +2693,7 @@
                 <w:i w:val="0"/>
                 <w:sz w:val="18"/>
               </w:rPr>
-              <w:t>—</w:t>
+              <w:t>--</w:t>
             </w:r>
           </w:p>
         </w:tc>
@@ -2711,7 +2711,7 @@
                 <w:i w:val="0"/>
                 <w:sz w:val="18"/>
               </w:rPr>
-              <w:t>—</w:t>
+              <w:t>--</w:t>
             </w:r>
           </w:p>
         </w:tc>
@@ -2729,7 +2729,7 @@
                 <w:i w:val="0"/>
                 <w:sz w:val="18"/>
               </w:rPr>
-              <w:t>—</w:t>
+              <w:t>--</w:t>
             </w:r>
           </w:p>
         </w:tc>
@@ -2747,7 +2747,7 @@
                 <w:i w:val="0"/>
                 <w:sz w:val="18"/>
               </w:rPr>
-              <w:t>—</w:t>
+              <w:t>--</w:t>
             </w:r>
           </w:p>
         </w:tc>
@@ -2764,7 +2764,7 @@
           <w:i w:val="0"/>
           <w:sz w:val="22"/>
         </w:rPr>
-        <w:t>IS, insertion sequence; MWU, Mann–Whitney U test (two-sided); BH, Benjamini–Hochberg FDR correction applied across all eight species × phenotype comparisons. 95% confidence intervals estimated by 5,000-replicate bootstrap resampling.</w:t>
+        <w:t>IS, insertion sequence; MWU, Mann-Whitney U test (two-sided); BH, Benjamini-Hochberg FDR correction applied across all eight species x phenotype comparisons. 95% confidence intervals estimated by 5,000-replicate bootstrap resampling.</w:t>
       </w:r>
     </w:p>
     <w:p>
@@ -2793,7 +2793,7 @@
           <w:i w:val="0"/>
           <w:sz w:val="22"/>
         </w:rPr>
-        <w:t xml:space="preserve"> isolates show near-identical IS densities across all nine strains (1.560–1.571/1,000 CDS, SD = 0.004), a uniformity inconsistent with stochastic assembly-quality-driven underestimation, which would be expected to introduce substantially higher variance. The IS keyword detection framework was validated using three keyword stringency levels (strict: transposase only; medium: +insertion sequence, IS element; liberal: +integrase, resolvase, mobile element), all of which yielded consistent direction and significance across species (ratio range 0.115–0.534-fold for ISS-reduced species, all </w:t>
+        <w:t xml:space="preserve"> isolates show near-identical IS densities across all nine strains (1.560-1.571/1,000 CDS, SD = 0.004), a uniformity inconsistent with stochastic assembly-quality-driven underestimation, which would be expected to introduce substantially higher variance. The IS keyword detection framework was validated using three keyword stringency levels (strict: transposase only; medium: +insertion sequence, IS element; liberal: +integrase, resolvase, mobile element), all of which yielded consistent direction and significance across species (ratio range 0.115-0.534-fold for ISS-reduced species, all </w:t>
       </w:r>
       <w:r>
         <w:rPr>
@@ -2830,7 +2830,7 @@
           <w:i w:val="0"/>
           <w:sz w:val="22"/>
         </w:rPr>
-        <w:t xml:space="preserve">To test whether CRISPR-Cas loss and IS element reduction are mechanistically linked—consistent with a coordinated defence system investment reduction—we compared IS element density in CRISPR-positive versus CRISPR-negative </w:t>
+        <w:t xml:space="preserve">To test whether CRISPR-Cas loss and IS element reduction are mechanistically linked--consistent with a coordinated defence system investment reduction--we compared IS element density in CRISPR-positive versus CRISPR-negative </w:t>
       </w:r>
       <w:r>
         <w:rPr>
@@ -2862,7 +2862,7 @@
           <w:i w:val="0"/>
           <w:sz w:val="22"/>
         </w:rPr>
-        <w:t xml:space="preserve"> = 0.003, Cliff's δ = -0.75) (Figure 2). This relationship indicates that within the same species, CRISPR loss is strongly associated with IS element reduction, consistent with co-loss of the two defence compartments rather than independent, uncorrelated processes.</w:t>
+        <w:t xml:space="preserve"> = 0.003, Cliff's delta = -0.75) (Figure 2). This relationship indicates that within the same species, CRISPR loss is strongly associated with IS element reduction, consistent with co-loss of the two defence compartments rather than independent, uncorrelated processes.</w:t>
       </w:r>
     </w:p>
     <w:p>
@@ -2883,7 +2883,7 @@
           <w:i w:val="0"/>
           <w:sz w:val="22"/>
         </w:rPr>
-        <w:t>As an independent validation using a wholly distinct dataset and methodology, we analysed CRISPR-associated KEGG Orthology (KO) gene densities from the GLDS-224 ISS metagenome dataset (NASA GeneLab), comprising shotgun metagenomics of ISS debris and ground control samples. CRISPR-associated gene density (KEGG K-numbers corresponding to Cas1–9 and associated proteins; verified set of 19 KO identifiers) was 49.7% lower in ISS debris samples than in matched ground debris controls (ISS debris: mean 0.668/1,000 annotated KOs; Ground debris: mean 1.328/1,000 annotated KOs; ratio 0.503-fold) (Figure 2 inset). This metagenomics-level reduction, derived from a community-averaged functional gene catalogue rather than from individual genomes, independently corroborates the whole-genome findings. ISS HEPA filter samples showed elevated apparent CRISPR densities (3.0–4.4/1,000 KOs), consistent with enrichment of phage-associated sequences by mechanical filtration and therefore excluded from the ground comparison.</w:t>
+        <w:t>As an independent validation using a wholly distinct dataset and methodology, we analysed CRISPR-associated KEGG Orthology (KO) gene densities from the GLDS-224 ISS metagenome dataset (NASA GeneLab), comprising shotgun metagenomics of ISS debris and ground control samples. CRISPR-associated gene density (KEGG K-numbers corresponding to Cas1-9 and associated proteins; verified set of 19 KO identifiers) was 49.7% lower in ISS debris samples than in matched ground debris controls (ISS debris: mean 0.668/1,000 annotated KOs; Ground debris: mean 1.328/1,000 annotated KOs; ratio 0.503-fold) (Figure 2 inset). This metagenomics-level reduction, derived from a community-averaged functional gene catalogue rather than from individual genomes, independently corroborates the whole-genome findings. ISS HEPA filter samples showed elevated apparent CRISPR densities (3.0-4.4/1,000 KOs), consistent with enrichment of phage-associated sequences by mechanical filtration and therefore excluded from the ground comparison.</w:t>
       </w:r>
     </w:p>
     <w:p>
@@ -2962,7 +2962,7 @@
           <w:i w:val="0"/>
           <w:sz w:val="22"/>
         </w:rPr>
-        <w:t xml:space="preserve">Our species-stratified comparative genomic analysis provides evidence that two major categories of defence-associated genetic elements—CRISPR-Cas adaptive immune systems and IS elements—are coordinately reduced in ISS-associated Bacillales. This pattern is most clearly demonstrated in </w:t>
+        <w:t xml:space="preserve">Our species-stratified comparative genomic analysis provides evidence that two major categories of defence-associated genetic elements--CRISPR-Cas adaptive immune systems and IS elements--are coordinately reduced in ISS-associated Bacillales. This pattern is most clearly demonstrated in </w:t>
       </w:r>
       <w:r>
         <w:rPr>
@@ -3042,7 +3042,7 @@
           <w:i w:val="0"/>
           <w:sz w:val="22"/>
         </w:rPr>
-        <w:t xml:space="preserve"> = 0.003, Cliff's δ = -0.75). Independent support from an entirely different analytical approach—KEGG metagenomics at community scale (GLDS-224, 0.503-fold reduction)—further reinforces this conclusion.</w:t>
+        <w:t xml:space="preserve"> = 0.003, Cliff's delta = -0.75). Independent support from an entirely different analytical approach--KEGG metagenomics at community scale (GLDS-224, 0.503-fold reduction)--further reinforces this conclusion.</w:t>
       </w:r>
     </w:p>
     <w:p>
@@ -3055,7 +3055,7 @@
           <w:i w:val="0"/>
           <w:sz w:val="22"/>
         </w:rPr>
-        <w:t>We interpret these findings as consistent with a model of defence system streamlining under closed-environment selection. The ISS is characterised by: (i) near-absence of novel environmental phage sources, reducing the adaptive value of CRISPR-Cas memory acquisition; (ii) physical isolation from horizontal gene transfer reservoirs, diminishing the selective benefit of IS-mediated genomic flexibility; and (iii) small effective population size, potentially amplifying genetic drift and reducing the efficacy of purifying selection against costly defence elements. Together, these conditions mirror those associated with reductive genome evolution in obligate intracellular bacteria and host-restricted pathogens—well-documented cases in which genes dispensable in stable, isolated environments are progressively lost</w:t>
+        <w:t>We interpret these findings as consistent with a model of defence system streamlining under closed-environment selection. The ISS is characterised by: (i) near-absence of novel environmental phage sources, reducing the adaptive value of CRISPR-Cas memory acquisition; (ii) physical isolation from horizontal gene transfer reservoirs, diminishing the selective benefit of IS-mediated genomic flexibility; and (iii) small effective population size, potentially amplifying genetic drift and reducing the efficacy of purifying selection against costly defence elements. Together, these conditions mirror those associated with reductive genome evolution in obligate intracellular bacteria and host-restricted pathogens--well-documented cases in which genes dispensable in stable, isolated environments are progressively lost</w:t>
       </w:r>
       <w:r>
         <w:rPr>
@@ -3188,7 +3188,7 @@
           <w:i w:val="0"/>
           <w:sz w:val="22"/>
         </w:rPr>
-        <w:t xml:space="preserve"> = 0.043, Cliff's δ = +0.57) contradicts the streamlining model as formulated above and requires explicit discussion. </w:t>
+        <w:t xml:space="preserve"> = 0.043, Cliff's delta = +0.57) contradicts the streamlining model as formulated above and requires explicit discussion. </w:t>
       </w:r>
       <w:r>
         <w:rPr>
@@ -3253,7 +3253,7 @@
           <w:i w:val="0"/>
           <w:sz w:val="22"/>
         </w:rPr>
-        <w:t xml:space="preserve"> may reflect a distinct adaptive strategy—genomic plasticity rather than streamlining—that has been favoured in this lineage under ISS conditions. Phylogenomic analysis of the ISS and ground </w:t>
+        <w:t xml:space="preserve"> may reflect a distinct adaptive strategy--genomic plasticity rather than streamlining--that has been favoured in this lineage under ISS conditions. Phylogenomic analysis of the ISS and ground </w:t>
       </w:r>
       <w:r>
         <w:rPr>
@@ -3413,7 +3413,7 @@
           <w:i w:val="0"/>
           <w:sz w:val="22"/>
         </w:rPr>
-        <w:t xml:space="preserve"> = 0.0095), this power estimate informs not the current finding's validity but its reproducibility: there is a ~22% probability that a study of the same design would fail to detect the effect at α = 0.05. We recommend confirmation in a larger ISS </w:t>
+        <w:t xml:space="preserve"> = 0.0095), this power estimate informs not the current finding's validity but its reproducibility: there is a ~22% probability that a study of the same design would fail to detect the effect at alpha = 0.05. We recommend confirmation in a larger ISS </w:t>
       </w:r>
       <w:r>
         <w:rPr>
@@ -3649,7 +3649,7 @@
           <w:i w:val="0"/>
           <w:sz w:val="22"/>
         </w:rPr>
-        <w:t xml:space="preserve"> (n = 10), prioritising chromosome-complete assemblies with NCBI PGAP annotation. All GFF3 files were downloaded 2025–2026 and were annotated with the NCBI RefSeq PGAP pipeline (confirmed by GFF header metadata), ensuring annotation pipeline uniformity across both panels.</w:t>
+        <w:t xml:space="preserve"> (n = 10), prioritising chromosome-complete assemblies with NCBI PGAP annotation. All GFF3 files were downloaded 2025-2026 and were annotated with the NCBI RefSeq PGAP pipeline (confirmed by GFF header metadata), ensuring annotation pipeline uniformity across both panels.</w:t>
       </w:r>
     </w:p>
     <w:p>
@@ -3787,7 +3787,7 @@
           <w:i w:val="0"/>
           <w:sz w:val="22"/>
         </w:rPr>
-        <w:t>Mann–Whitney U test.</w:t>
+        <w:t>Mann-Whitney U test.</w:t>
       </w:r>
       <w:r>
         <w:rPr>
@@ -3795,7 +3795,7 @@
           <w:i w:val="0"/>
           <w:sz w:val="22"/>
         </w:rPr>
-        <w:t xml:space="preserve"> Two-sided Mann–Whitney U statistics and normal-approximation </w:t>
+        <w:t xml:space="preserve"> Two-sided Mann-Whitney U statistics and normal-approximation </w:t>
       </w:r>
       <w:r>
         <w:rPr>
@@ -3832,7 +3832,7 @@
           <w:i w:val="0"/>
           <w:sz w:val="22"/>
         </w:rPr>
-        <w:t xml:space="preserve"> Cliff's delta (δ) was computed as the proportion-of-pairs dominance statistic: δ = (number of pairs where X &gt; Y - number of pairs where X &lt; Y) / (n_ISS × n_Ground). Values range from -1.0 (complete dominance of ISS over Ground) to +1.0 (reverse). Bootstrap 95% confidence intervals for δ were estimated from 5,000 resampled datasets per comparison.</w:t>
+        <w:t xml:space="preserve"> Cliff's delta (delta) was computed as the proportion-of-pairs dominance statistic: delta = (number of pairs where X &gt; Y - number of pairs where X &lt; Y) / (n_ISS x n_Ground). Values range from -1.0 (complete dominance of ISS over Ground) to +1.0 (reverse). Bootstrap 95% confidence intervals for delta were estimated from 5,000 resampled datasets per comparison.</w:t>
       </w:r>
     </w:p>
     <w:p>
@@ -3853,7 +3853,7 @@
           <w:i w:val="0"/>
           <w:sz w:val="22"/>
         </w:rPr>
-        <w:t xml:space="preserve"> Benjamini–Hochberg false discovery rate (FDR) correction was applied simultaneously to all eight species × phenotype comparisons (four species × CRISPR + four species × IS element), controlling the expected FDR at 5%</w:t>
+        <w:t xml:space="preserve"> Benjamini-Hochberg false discovery rate (FDR) correction was applied simultaneously to all eight species x phenotype comparisons (four species x CRISPR + four species x IS element), controlling the expected FDR at 5%</w:t>
       </w:r>
       <w:r>
         <w:rPr>
@@ -3891,7 +3891,7 @@
           <w:i w:val="0"/>
           <w:sz w:val="22"/>
         </w:rPr>
-        <w:t xml:space="preserve"> Post-hoc power analyses were performed by Monte Carlo simulation (10,000 trials per test): for Fisher's exact test, CRISPR-positive counts were simulated from binomial distributions parametrised by the observed ISS and Ground prevalences; for Mann–Whitney U tests, IS densities were sampled from Gaussian distributions parametrised by observed means and standard deviations, with power defined as the proportion of simulated trials yielding </w:t>
+        <w:t xml:space="preserve"> Post-hoc power analyses were performed by Monte Carlo simulation (10,000 trials per test): for Fisher's exact test, CRISPR-positive counts were simulated from binomial distributions parametrised by the observed ISS and Ground prevalences; for Mann-Whitney U tests, IS densities were sampled from Gaussian distributions parametrised by observed means and standard deviations, with power defined as the proportion of simulated trials yielding </w:t>
       </w:r>
       <w:r>
         <w:rPr>
@@ -3920,7 +3920,7 @@
           <w:i w:val="0"/>
           <w:sz w:val="22"/>
         </w:rPr>
-        <w:t>CRISPR × IS co-occurrence analysis.</w:t>
+        <w:t>CRISPR x IS co-occurrence analysis.</w:t>
       </w:r>
       <w:r>
         <w:rPr>
@@ -3944,7 +3944,7 @@
           <w:i w:val="0"/>
           <w:sz w:val="22"/>
         </w:rPr>
-        <w:t xml:space="preserve"> strains from both panels (n = 24) were classified as CRISPR-positive or CRISPR-negative; IS element density was compared between groups using Mann–Whitney U and Cliff's delta.</w:t>
+        <w:t xml:space="preserve"> strains from both panels (n = 24) were classified as CRISPR-positive or CRISPR-negative; IS element density was compared between groups using Mann-Whitney U and Cliff's delta.</w:t>
       </w:r>
     </w:p>
     <w:p>
@@ -4286,7 +4286,7 @@
           <w:i w:val="0"/>
           <w:sz w:val="22"/>
         </w:rPr>
-        <w:t xml:space="preserve"> = 0.025; asterisk). Numbers indicate count/total per group. (b) Boxplots of IS element density (IS/1,000 CDS) by species and environment. ISS values are shown in orange, ground values in blue. Bold horizontal lines, medians; boxes, interquartile ranges; whiskers, 1.5 × IQR. Asterisks denote BH FDR-corrected significance: **</w:t>
+        <w:t xml:space="preserve"> = 0.025; asterisk). Numbers indicate count/total per group. (b) Boxplots of IS element density (IS/1,000 CDS) by species and environment. ISS values are shown in orange, ground values in blue. Bold horizontal lines, medians; boxes, interquartile ranges; whiskers, 1.5 x IQR. Asterisks denote BH FDR-corrected significance: **</w:t>
       </w:r>
       <w:r>
         <w:rPr>
@@ -4435,7 +4435,7 @@
           <w:i w:val="0"/>
           <w:sz w:val="22"/>
         </w:rPr>
-        <w:t xml:space="preserve"> = 0.003, Cliff's δ = -0.75). Dotted horizontal line, overall mean. (b) Inset: CRISPR-associated KO density (per thousand annotated KOs) in GLDS-224 ISS debris versus ground debris samples (n = 2 per group). ISS values are approximately half those of ground, providing metagenomics-level validation (ratio 0.503-fold).</w:t>
+        <w:t xml:space="preserve"> = 0.003, Cliff's delta = -0.75). Dotted horizontal line, overall mean. (b) Inset: CRISPR-associated KO density (per thousand annotated KOs) in GLDS-224 ISS debris versus ground debris samples (n = 2 per group). ISS values are approximately half those of ground, providing metagenomics-level validation (ratio 0.503-fold).</w:t>
       </w:r>
     </w:p>
     <w:p>
@@ -4665,7 +4665,7 @@
           <w:i w:val="0"/>
           <w:sz w:val="18"/>
         </w:rPr>
-        <w:t>:132–136.</w:t>
+        <w:t>:132-136.</w:t>
       </w:r>
     </w:p>
     <w:p>
@@ -4757,7 +4757,7 @@
           <w:i w:val="0"/>
           <w:sz w:val="18"/>
         </w:rPr>
-        <w:t>:1709–1712.</w:t>
+        <w:t>:1709-1712.</w:t>
       </w:r>
     </w:p>
     <w:p>
@@ -4803,7 +4803,7 @@
           <w:i w:val="0"/>
           <w:sz w:val="18"/>
         </w:rPr>
-        <w:t>:335–340.</w:t>
+        <w:t>:335-340.</w:t>
       </w:r>
     </w:p>
     <w:p>
@@ -4849,7 +4849,7 @@
           <w:i w:val="0"/>
           <w:sz w:val="18"/>
         </w:rPr>
-        <w:t>:2812–2825.</w:t>
+        <w:t>:2812-2825.</w:t>
       </w:r>
     </w:p>
     <w:p>
@@ -4895,7 +4895,7 @@
           <w:i w:val="0"/>
           <w:sz w:val="18"/>
         </w:rPr>
-        <w:t>:865–891.</w:t>
+        <w:t>:865-891.</w:t>
       </w:r>
     </w:p>
     <w:p>
@@ -4941,7 +4941,7 @@
           <w:i w:val="0"/>
           <w:sz w:val="18"/>
         </w:rPr>
-        <w:t>:25–33.</w:t>
+        <w:t>:25-33.</w:t>
       </w:r>
     </w:p>
     <w:p>
@@ -4987,7 +4987,7 @@
           <w:i w:val="0"/>
           <w:sz w:val="18"/>
         </w:rPr>
-        <w:t>:583–586.</w:t>
+        <w:t>:583-586.</w:t>
       </w:r>
     </w:p>
     <w:p>
@@ -5033,7 +5033,7 @@
           <w:i w:val="0"/>
           <w:sz w:val="18"/>
         </w:rPr>
-        <w:t>:13–26.</w:t>
+        <w:t>:13-26.</w:t>
       </w:r>
     </w:p>
     <w:p>
@@ -5079,7 +5079,7 @@
           <w:i w:val="0"/>
           <w:sz w:val="18"/>
         </w:rPr>
-        <w:t>:2097–2103.</w:t>
+        <w:t>:2097-2103.</w:t>
       </w:r>
     </w:p>
     <w:p>
@@ -5205,7 +5205,7 @@
           <w:i w:val="0"/>
           <w:sz w:val="18"/>
         </w:rPr>
-        <w:t>:1786–1801.</w:t>
+        <w:t>:1786-1801.</w:t>
       </w:r>
     </w:p>
     <w:p>
@@ -5251,7 +5251,7 @@
           <w:i w:val="0"/>
           <w:sz w:val="18"/>
         </w:rPr>
-        <w:t>:W246–W251.</w:t>
+        <w:t>:W246-W251.</w:t>
       </w:r>
     </w:p>
     <w:p>
@@ -5327,7 +5327,7 @@
           <w:i w:val="0"/>
           <w:sz w:val="18"/>
         </w:rPr>
-        <w:t>:289–300.</w:t>
+        <w:t>:289-300.</w:t>
       </w:r>
     </w:p>
     <w:p>
@@ -5433,7 +5433,7 @@
           <w:i w:val="0"/>
           <w:sz w:val="18"/>
         </w:rPr>
-        <w:t xml:space="preserve">18. Madhivanan K, Greenberg ML, Bhatt A. CRISPR-Cas system–an adaptive immune system in prokaryotes and its applications: a review. </w:t>
+        <w:t xml:space="preserve">18. Madhivanan K, Greenberg ML, Bhatt A. CRISPR-Cas system-an adaptive immune system in prokaryotes and its applications: a review. </w:t>
       </w:r>
       <w:r>
         <w:rPr>
@@ -5465,7 +5465,7 @@
           <w:i w:val="0"/>
           <w:sz w:val="18"/>
         </w:rPr>
-        <w:t>:6507–6526.</w:t>
+        <w:t>:6507-6526.</w:t>
       </w:r>
     </w:p>
     <w:p>
@@ -5511,7 +5511,7 @@
           <w:i w:val="0"/>
           <w:sz w:val="18"/>
         </w:rPr>
-        <w:t>:D785–D794.</w:t>
+        <w:t>:D785-D794.</w:t>
       </w:r>
     </w:p>
     <w:p>
@@ -5557,7 +5557,7 @@
           <w:i w:val="0"/>
           <w:sz w:val="18"/>
         </w:rPr>
-        <w:t>:1242–1245.</w:t>
+        <w:t>:1242-1245.</w:t>
       </w:r>
     </w:p>
     <w:p>
@@ -5794,7 +5794,7 @@
                 <w:b/>
                 <w:sz w:val="18"/>
               </w:rPr>
-              <w:t>Cliff's δ</w:t>
+              <w:t>Cliff's delta</w:t>
             </w:r>
           </w:p>
         </w:tc>
@@ -5904,7 +5904,7 @@
                 <w:i w:val="0"/>
                 <w:sz w:val="18"/>
               </w:rPr>
-              <w:t>0.368×</w:t>
+              <w:t>0.368x</w:t>
             </w:r>
           </w:p>
         </w:tc>
@@ -6032,7 +6032,7 @@
                 <w:i w:val="0"/>
                 <w:sz w:val="18"/>
               </w:rPr>
-              <w:t>0.369×</w:t>
+              <w:t>0.369x</w:t>
             </w:r>
           </w:p>
         </w:tc>
@@ -6160,7 +6160,7 @@
                 <w:i w:val="0"/>
                 <w:sz w:val="18"/>
               </w:rPr>
-              <w:t>0.534×</w:t>
+              <w:t>0.534x</w:t>
             </w:r>
           </w:p>
         </w:tc>
@@ -6448,7 +6448,7 @@
           <w:i w:val="0"/>
           <w:sz w:val="20"/>
         </w:rPr>
-        <w:t xml:space="preserve"> (Multiple testing): 4/8 comparisons retain significance after Benjamini–Hochberg FDR correction.</w:t>
+        <w:t xml:space="preserve"> (Multiple testing): 4/8 comparisons retain significance after Benjamini-Hochberg FDR correction.</w:t>
       </w:r>
     </w:p>
     <w:p>
@@ -6469,7 +6469,7 @@
           <w:i w:val="0"/>
           <w:sz w:val="20"/>
         </w:rPr>
-        <w:t xml:space="preserve"> (Bootstrap CI): Cliff's δ CI excludes zero for all three significant IS comparisons.</w:t>
+        <w:t xml:space="preserve"> (Bootstrap CI): Cliff's delta CI excludes zero for all three significant IS comparisons.</w:t>
       </w:r>
     </w:p>
     <w:p>

</xml_diff>